<commit_message>
Added material to documents
</commit_message>
<xml_diff>
--- a/public/word-templates/BilateralAgreement2026.docx
+++ b/public/word-templates/BilateralAgreement2026.docx
@@ -61,7 +61,7 @@
               <w:rPr>
                 <w:sz w:val="14"/>
                 <w:szCs w:val="14"/>
-                <w:lang w:val="kk-KZ"/>
+                <w:lang w:val="en-US"/>
               </w:rPr>
             </w:pPr>
             <w:r>
@@ -93,7 +93,41 @@
                 <w:sz w:val="14"/>
                 <w:szCs w:val="14"/>
               </w:rPr>
-              <w:t>№________</w:t>
+              <w:t>№</w:t>
+            </w:r>
+            <w:r>
+              <w:rPr>
+                <w:sz w:val="14"/>
+                <w:szCs w:val="14"/>
+                <w:lang w:val="kk-KZ"/>
+              </w:rPr>
+              <w:t xml:space="preserve"> </w:t>
+            </w:r>
+            <w:r>
+              <w:rPr>
+                <w:sz w:val="14"/>
+                <w:szCs w:val="14"/>
+                <w:lang w:val="en-US"/>
+              </w:rPr>
+              <w:t>${</w:t>
+            </w:r>
+            <w:proofErr w:type="spellStart"/>
+            <w:r>
+              <w:rPr>
+                <w:sz w:val="14"/>
+                <w:szCs w:val="14"/>
+                <w:lang w:val="en-US"/>
+              </w:rPr>
+              <w:t>case_number</w:t>
+            </w:r>
+            <w:proofErr w:type="spellEnd"/>
+            <w:r>
+              <w:rPr>
+                <w:sz w:val="14"/>
+                <w:szCs w:val="14"/>
+                <w:lang w:val="en-US"/>
+              </w:rPr>
+              <w:t>}</w:t>
             </w:r>
           </w:p>
           <w:p>
@@ -234,6 +268,7 @@
               <w:rPr>
                 <w:sz w:val="14"/>
                 <w:szCs w:val="14"/>
+                <w:lang w:val="ru-RU"/>
               </w:rPr>
             </w:pPr>
             <w:r>
@@ -249,7 +284,41 @@
                 <w:sz w:val="14"/>
                 <w:szCs w:val="14"/>
               </w:rPr>
-              <w:t>ОГОВОР №________</w:t>
+              <w:t>ОГОВОР №</w:t>
+            </w:r>
+            <w:r>
+              <w:rPr>
+                <w:sz w:val="14"/>
+                <w:szCs w:val="14"/>
+                <w:lang w:val="ru-RU"/>
+              </w:rPr>
+              <w:t xml:space="preserve"> </w:t>
+            </w:r>
+            <w:r>
+              <w:rPr>
+                <w:sz w:val="14"/>
+                <w:szCs w:val="14"/>
+                <w:lang w:val="en-US"/>
+              </w:rPr>
+              <w:t>${</w:t>
+            </w:r>
+            <w:proofErr w:type="spellStart"/>
+            <w:r>
+              <w:rPr>
+                <w:sz w:val="14"/>
+                <w:szCs w:val="14"/>
+                <w:lang w:val="en-US"/>
+              </w:rPr>
+              <w:t>case_number</w:t>
+            </w:r>
+            <w:proofErr w:type="spellEnd"/>
+            <w:r>
+              <w:rPr>
+                <w:sz w:val="14"/>
+                <w:szCs w:val="14"/>
+                <w:lang w:val="en-US"/>
+              </w:rPr>
+              <w:t>}</w:t>
             </w:r>
           </w:p>
           <w:p>
@@ -1126,40 +1195,22 @@
                 <w:szCs w:val="10"/>
                 <w:lang w:val="ru-RU"/>
               </w:rPr>
-              <w:t xml:space="preserve">(фамилия, имя, </w:t>
-            </w:r>
-            <w:proofErr w:type="gramStart"/>
-            <w:r>
-              <w:rPr>
-                <w:sz w:val="10"/>
-                <w:szCs w:val="10"/>
-                <w:lang w:val="ru-RU"/>
-              </w:rPr>
-              <w:t>отчество)</w:t>
-            </w:r>
-            <w:r>
-              <w:rPr>
-                <w:sz w:val="14"/>
-                <w:szCs w:val="14"/>
-              </w:rPr>
-              <w:t xml:space="preserve"> </w:t>
-            </w:r>
-            <w:r>
-              <w:rPr>
-                <w:sz w:val="14"/>
-                <w:szCs w:val="14"/>
-                <w:lang w:val="ru-RU"/>
-              </w:rPr>
-              <w:t xml:space="preserve">  </w:t>
-            </w:r>
-            <w:proofErr w:type="gramEnd"/>
-            <w:r>
-              <w:rPr>
-                <w:sz w:val="14"/>
-                <w:szCs w:val="14"/>
-                <w:lang w:val="ru-RU"/>
-              </w:rPr>
-              <w:t xml:space="preserve">                                                        </w:t>
+              <w:t>(фамилия, имя, отчество)</w:t>
+            </w:r>
+            <w:r>
+              <w:rPr>
+                <w:sz w:val="14"/>
+                <w:szCs w:val="14"/>
+              </w:rPr>
+              <w:t xml:space="preserve"> </w:t>
+            </w:r>
+            <w:r>
+              <w:rPr>
+                <w:sz w:val="14"/>
+                <w:szCs w:val="14"/>
+                <w:lang w:val="ru-RU"/>
+              </w:rPr>
+              <w:t xml:space="preserve">                                                          </w:t>
             </w:r>
             <w:r>
               <w:rPr>
@@ -1607,6 +1658,7 @@
                       <w:b/>
                       <w:sz w:val="14"/>
                       <w:szCs w:val="14"/>
+                      <w:lang w:val="kk-KZ"/>
                     </w:rPr>
                     <w:t>${</w:t>
                   </w:r>
@@ -1626,48 +1678,9 @@
                       <w:b/>
                       <w:sz w:val="14"/>
                       <w:szCs w:val="14"/>
+                      <w:lang w:val="kk-KZ"/>
                     </w:rPr>
-                    <w:t>_</w:t>
-                  </w:r>
-                  <w:r>
-                    <w:rPr>
-                      <w:rFonts w:ascii="Times New Roman" w:hAnsi="Times New Roman"/>
-                      <w:b/>
-                      <w:sz w:val="14"/>
-                      <w:szCs w:val="14"/>
-                      <w:lang w:val="en-US"/>
-                    </w:rPr>
-                    <w:t>group</w:t>
-                  </w:r>
-                  <w:r>
-                    <w:rPr>
-                      <w:rFonts w:ascii="Times New Roman" w:hAnsi="Times New Roman"/>
-                      <w:b/>
-                      <w:sz w:val="14"/>
-                      <w:szCs w:val="14"/>
-                    </w:rPr>
-                    <w:t>_</w:t>
-                  </w:r>
-                  <w:proofErr w:type="spellStart"/>
-                  <w:r>
-                    <w:rPr>
-                      <w:rFonts w:ascii="Times New Roman" w:hAnsi="Times New Roman"/>
-                      <w:b/>
-                      <w:sz w:val="14"/>
-                      <w:szCs w:val="14"/>
-                      <w:lang w:val="en-US"/>
-                    </w:rPr>
-                    <w:t>kz</w:t>
-                  </w:r>
-                  <w:proofErr w:type="spellEnd"/>
-                  <w:r>
-                    <w:rPr>
-                      <w:rFonts w:ascii="Times New Roman" w:hAnsi="Times New Roman"/>
-                      <w:b/>
-                      <w:sz w:val="14"/>
-                      <w:szCs w:val="14"/>
-                    </w:rPr>
-                    <w:t>}</w:t>
+                    <w:t>_group_kz}</w:t>
                   </w:r>
                 </w:p>
               </w:tc>
@@ -11258,33 +11271,15 @@
                 <w:szCs w:val="14"/>
                 <w:lang w:val="ru-RU"/>
               </w:rPr>
-              <w:t>3.1.</w:t>
-            </w:r>
-            <w:proofErr w:type="gramStart"/>
-            <w:r>
-              <w:rPr>
-                <w:sz w:val="14"/>
-                <w:szCs w:val="14"/>
-                <w:lang w:val="ru-RU"/>
-              </w:rPr>
-              <w:t>15.</w:t>
-            </w:r>
-            <w:r>
-              <w:rPr>
-                <w:sz w:val="14"/>
-                <w:szCs w:val="14"/>
-                <w:lang w:val="kk-KZ"/>
-              </w:rPr>
-              <w:t>шетелдік</w:t>
-            </w:r>
-            <w:proofErr w:type="gramEnd"/>
-            <w:r>
-              <w:rPr>
-                <w:sz w:val="14"/>
-                <w:szCs w:val="14"/>
-                <w:lang w:val="kk-KZ"/>
-              </w:rPr>
-              <w:t xml:space="preserve"> студенттер Қазақстан Республикасының аумағына келгеннен кейін күнтізбелік 5 күн ішінде көші-қон есебіне қою рәсімінен дербес өтеді, бұл ретте шетелдік азаматтың паспорты Академия өкілдерінің көмегімен тұрақты немесе уақытша тұратын жері бойынша күнтізбелік 5 күн ішінде болатын жері бойынша ішкі істер органдарында тіркелуге тиіс. Шетелдік студенттердің паспорттары бір оқу жылына тіркеледі;</w:t>
+              <w:t>3.1.15.</w:t>
+            </w:r>
+            <w:r>
+              <w:rPr>
+                <w:sz w:val="14"/>
+                <w:szCs w:val="14"/>
+                <w:lang w:val="kk-KZ"/>
+              </w:rPr>
+              <w:t>шетелдік студенттер Қазақстан Республикасының аумағына келгеннен кейін күнтізбелік 5 күн ішінде көші-қон есебіне қою рәсімінен дербес өтеді, бұл ретте шетелдік азаматтың паспорты Академия өкілдерінің көмегімен тұрақты немесе уақытша тұратын жері бойынша күнтізбелік 5 күн ішінде болатын жері бойынша ішкі істер органдарында тіркелуге тиіс. Шетелдік студенттердің паспорттары бір оқу жылына тіркеледі;</w:t>
             </w:r>
           </w:p>
           <w:p>
@@ -12255,7 +12250,6 @@
               <w:t xml:space="preserve"> беру гранты </w:t>
             </w:r>
             <w:proofErr w:type="spellStart"/>
-            <w:proofErr w:type="gramStart"/>
             <w:r>
               <w:rPr>
                 <w:sz w:val="14"/>
@@ -12283,7 +12277,6 @@
               <w:t>алушы</w:t>
             </w:r>
             <w:proofErr w:type="spellEnd"/>
-            <w:proofErr w:type="gramEnd"/>
             <w:r>
               <w:rPr>
                 <w:sz w:val="14"/>
@@ -16796,25 +16789,7 @@
                 <w:szCs w:val="14"/>
                 <w:lang w:val="ru-RU"/>
               </w:rPr>
-              <w:t>лет. (п.17 ст.47 Закона РК «Об образовании», п.6 гл.</w:t>
-            </w:r>
-            <w:proofErr w:type="gramStart"/>
-            <w:r>
-              <w:rPr>
-                <w:sz w:val="14"/>
-                <w:szCs w:val="14"/>
-                <w:lang w:val="ru-RU"/>
-              </w:rPr>
-              <w:t>2  приказ</w:t>
-            </w:r>
-            <w:proofErr w:type="gramEnd"/>
-            <w:r>
-              <w:rPr>
-                <w:sz w:val="14"/>
-                <w:szCs w:val="14"/>
-                <w:lang w:val="ru-RU"/>
-              </w:rPr>
-              <w:t xml:space="preserve"> И.О Министра  </w:t>
+              <w:t xml:space="preserve">лет. (п.17 ст.47 Закона РК «Об образовании», п.6 гл.2  приказ И.О Министра  </w:t>
             </w:r>
             <w:proofErr w:type="spellStart"/>
             <w:r>
@@ -21697,27 +21672,7 @@
                 <w:sz w:val="14"/>
                 <w:szCs w:val="14"/>
               </w:rPr>
-              <w:t xml:space="preserve">ҚР ӘМ/ </w:t>
-            </w:r>
-            <w:proofErr w:type="gramStart"/>
-            <w:r>
-              <w:rPr>
-                <w:rFonts w:ascii="Times New Roman" w:eastAsia="Times New Roman" w:hAnsi="Times New Roman"/>
-                <w:bCs/>
-                <w:sz w:val="14"/>
-                <w:szCs w:val="14"/>
-              </w:rPr>
-              <w:t>ІІМ  «</w:t>
-            </w:r>
-            <w:proofErr w:type="gramEnd"/>
-            <w:r>
-              <w:rPr>
-                <w:rFonts w:ascii="Times New Roman" w:eastAsia="Times New Roman" w:hAnsi="Times New Roman"/>
-                <w:bCs/>
-                <w:sz w:val="14"/>
-                <w:szCs w:val="14"/>
-              </w:rPr>
-              <w:t xml:space="preserve">___»_____20___ж. </w:t>
+              <w:t xml:space="preserve">ҚР ӘМ/ ІІМ  «___»_____20___ж. </w:t>
             </w:r>
             <w:proofErr w:type="spellStart"/>
             <w:r>
@@ -21831,7 +21786,6 @@
                 <w:szCs w:val="14"/>
               </w:rPr>
             </w:pPr>
-            <w:proofErr w:type="gramStart"/>
             <w:r>
               <w:rPr>
                 <w:rFonts w:ascii="Times New Roman" w:eastAsia="Times New Roman" w:hAnsi="Times New Roman"/>
@@ -21839,17 +21793,7 @@
                 <w:sz w:val="14"/>
                 <w:szCs w:val="14"/>
               </w:rPr>
-              <w:t>ҚР,_</w:t>
-            </w:r>
-            <w:proofErr w:type="gramEnd"/>
-            <w:r>
-              <w:rPr>
-                <w:rFonts w:ascii="Times New Roman" w:eastAsia="Times New Roman" w:hAnsi="Times New Roman"/>
-                <w:bCs/>
-                <w:sz w:val="14"/>
-                <w:szCs w:val="14"/>
-              </w:rPr>
-              <w:t>_________________________________________________________________________________________</w:t>
+              <w:t>ҚР,__________________________________________________________________________________________</w:t>
             </w:r>
           </w:p>
           <w:p>
@@ -22908,29 +22852,7 @@
                 <w:szCs w:val="14"/>
                 <w:lang w:val="ru-RU"/>
               </w:rPr>
-              <w:t>выдано МЮ/ МВД РК от «__</w:t>
-            </w:r>
-            <w:proofErr w:type="gramStart"/>
-            <w:r>
-              <w:rPr>
-                <w:b w:val="0"/>
-                <w:bCs/>
-                <w:sz w:val="14"/>
-                <w:szCs w:val="14"/>
-                <w:lang w:val="ru-RU"/>
-              </w:rPr>
-              <w:t>_»_</w:t>
-            </w:r>
-            <w:proofErr w:type="gramEnd"/>
-            <w:r>
-              <w:rPr>
-                <w:b w:val="0"/>
-                <w:bCs/>
-                <w:sz w:val="14"/>
-                <w:szCs w:val="14"/>
-                <w:lang w:val="ru-RU"/>
-              </w:rPr>
-              <w:t>____________20___г.</w:t>
+              <w:t>выдано МЮ/ МВД РК от «___»_____________20___г.</w:t>
             </w:r>
           </w:p>
           <w:p>
@@ -22977,7 +22899,6 @@
                 <w:lang w:val="kk-KZ"/>
               </w:rPr>
             </w:pPr>
-            <w:proofErr w:type="gramStart"/>
             <w:r>
               <w:rPr>
                 <w:rFonts w:ascii="Times New Roman" w:hAnsi="Times New Roman"/>
@@ -22994,17 +22915,7 @@
                 <w:sz w:val="14"/>
                 <w:szCs w:val="14"/>
               </w:rPr>
-              <w:t>_</w:t>
-            </w:r>
-            <w:proofErr w:type="gramEnd"/>
-            <w:r>
-              <w:rPr>
-                <w:rFonts w:ascii="Times New Roman" w:eastAsia="Times New Roman" w:hAnsi="Times New Roman"/>
-                <w:bCs/>
-                <w:sz w:val="14"/>
-                <w:szCs w:val="14"/>
-              </w:rPr>
-              <w:t>________________________</w:t>
+              <w:t>_________________________</w:t>
             </w:r>
           </w:p>
           <w:p>
@@ -23364,7 +23275,27 @@
                 <w:szCs w:val="14"/>
                 <w:lang w:val="kk-KZ"/>
               </w:rPr>
-              <w:t xml:space="preserve">Аадемиялық қызмет </w:t>
+              <w:t>А</w:t>
+            </w:r>
+            <w:r>
+              <w:rPr>
+                <w:rFonts w:ascii="Times New Roman" w:hAnsi="Times New Roman"/>
+                <w:b/>
+                <w:sz w:val="14"/>
+                <w:szCs w:val="14"/>
+                <w:lang w:val="kk-KZ"/>
+              </w:rPr>
+              <w:t>ка</w:t>
+            </w:r>
+            <w:r>
+              <w:rPr>
+                <w:rFonts w:ascii="Times New Roman" w:hAnsi="Times New Roman"/>
+                <w:b/>
+                <w:sz w:val="14"/>
+                <w:szCs w:val="14"/>
+                <w:lang w:val="kk-KZ"/>
+              </w:rPr>
+              <w:t xml:space="preserve">демиялық қызмет </w:t>
             </w:r>
             <w:proofErr w:type="spellStart"/>
             <w:r>
@@ -24438,27 +24369,7 @@
                 <w:sz w:val="12"/>
                 <w:szCs w:val="24"/>
               </w:rPr>
-              <w:t>/</w:t>
-            </w:r>
-            <w:proofErr w:type="gramStart"/>
-            <w:r>
-              <w:rPr>
-                <w:rFonts w:ascii="Times New Roman" w:hAnsi="Times New Roman"/>
-                <w:bCs/>
-                <w:sz w:val="12"/>
-                <w:szCs w:val="24"/>
-              </w:rPr>
-              <w:t xml:space="preserve">подпись)   </w:t>
-            </w:r>
-            <w:proofErr w:type="gramEnd"/>
-            <w:r>
-              <w:rPr>
-                <w:rFonts w:ascii="Times New Roman" w:hAnsi="Times New Roman"/>
-                <w:bCs/>
-                <w:sz w:val="12"/>
-                <w:szCs w:val="24"/>
-              </w:rPr>
-              <w:t xml:space="preserve">                                     (</w:t>
+              <w:t>/подпись)                                        (</w:t>
             </w:r>
             <w:proofErr w:type="spellStart"/>
             <w:r>
@@ -25795,25 +25706,7 @@
                 <w:szCs w:val="14"/>
                 <w:lang w:val="ru-RU"/>
               </w:rPr>
-              <w:t>от «______</w:t>
-            </w:r>
-            <w:proofErr w:type="gramStart"/>
-            <w:r>
-              <w:rPr>
-                <w:sz w:val="14"/>
-                <w:szCs w:val="14"/>
-                <w:lang w:val="ru-RU"/>
-              </w:rPr>
-              <w:t>_»_</w:t>
-            </w:r>
-            <w:proofErr w:type="gramEnd"/>
-            <w:r>
-              <w:rPr>
-                <w:sz w:val="14"/>
-                <w:szCs w:val="14"/>
-                <w:lang w:val="ru-RU"/>
-              </w:rPr>
-              <w:t>_________________2026г</w:t>
+              <w:t>от «_______»__________________2026г</w:t>
             </w:r>
             <w:r>
               <w:rPr>
@@ -27067,25 +26960,7 @@
                 <w:szCs w:val="14"/>
                 <w:lang w:val="kk-KZ"/>
               </w:rPr>
-              <w:t xml:space="preserve">Білім </w:t>
-            </w:r>
-            <w:proofErr w:type="gramStart"/>
-            <w:r>
-              <w:rPr>
-                <w:sz w:val="14"/>
-                <w:szCs w:val="14"/>
-                <w:lang w:val="kk-KZ"/>
-              </w:rPr>
-              <w:t>алушы  оқу</w:t>
-            </w:r>
-            <w:proofErr w:type="gramEnd"/>
-            <w:r>
-              <w:rPr>
-                <w:sz w:val="14"/>
-                <w:szCs w:val="14"/>
-                <w:lang w:val="kk-KZ"/>
-              </w:rPr>
-              <w:t xml:space="preserve"> ақысын төлеу мерзімі бойынша міндеттерін орындамаған жағдайда, төлеу мерзімі өткен әрбір </w:t>
+              <w:t xml:space="preserve">Білім алушы  оқу ақысын төлеу мерзімі бойынша міндеттерін орындамаған жағдайда, төлеу мерзімі өткен әрбір </w:t>
             </w:r>
             <w:r>
               <w:rPr>
@@ -27833,20 +27708,8 @@
                 <w:sz w:val="14"/>
                 <w:szCs w:val="14"/>
               </w:rPr>
-              <w:t>»</w:t>
-            </w:r>
-            <w:proofErr w:type="gramStart"/>
-            <w:r>
-              <w:rPr>
-                <w:rFonts w:ascii="Times New Roman" w:hAnsi="Times New Roman"/>
-                <w:b/>
-                <w:bCs/>
-                <w:sz w:val="14"/>
-                <w:szCs w:val="14"/>
-              </w:rPr>
-              <w:t>/«</w:t>
-            </w:r>
-            <w:proofErr w:type="gramEnd"/>
+              <w:t>»/«</w:t>
+            </w:r>
             <w:r>
               <w:rPr>
                 <w:rFonts w:ascii="Times New Roman" w:hAnsi="Times New Roman"/>
@@ -28033,7 +27896,6 @@
               </w:rPr>
               <w:t>/</w:t>
             </w:r>
-            <w:proofErr w:type="gramStart"/>
             <w:r>
               <w:rPr>
                 <w:rFonts w:ascii="Times New Roman" w:hAnsi="Times New Roman"/>
@@ -28050,17 +27912,7 @@
                 <w:sz w:val="14"/>
                 <w:szCs w:val="14"/>
               </w:rPr>
-              <w:t xml:space="preserve">)   </w:t>
-            </w:r>
-            <w:proofErr w:type="gramEnd"/>
-            <w:r>
-              <w:rPr>
-                <w:rFonts w:ascii="Times New Roman" w:hAnsi="Times New Roman"/>
-                <w:bCs/>
-                <w:sz w:val="14"/>
-                <w:szCs w:val="14"/>
-              </w:rPr>
-              <w:t xml:space="preserve">                            (</w:t>
+              <w:t>)                               (</w:t>
             </w:r>
             <w:proofErr w:type="spellStart"/>
             <w:r>
@@ -28342,25 +28194,7 @@
                 <w:sz w:val="14"/>
                 <w:szCs w:val="14"/>
               </w:rPr>
-              <w:t>/</w:t>
-            </w:r>
-            <w:proofErr w:type="gramStart"/>
-            <w:r>
-              <w:rPr>
-                <w:rFonts w:ascii="Times New Roman" w:hAnsi="Times New Roman"/>
-                <w:sz w:val="14"/>
-                <w:szCs w:val="14"/>
-              </w:rPr>
-              <w:t xml:space="preserve">подпись)   </w:t>
-            </w:r>
-            <w:proofErr w:type="gramEnd"/>
-            <w:r>
-              <w:rPr>
-                <w:rFonts w:ascii="Times New Roman" w:hAnsi="Times New Roman"/>
-                <w:sz w:val="14"/>
-                <w:szCs w:val="14"/>
-              </w:rPr>
-              <w:t xml:space="preserve">                                     (</w:t>
+              <w:t>/подпись)                                        (</w:t>
             </w:r>
             <w:proofErr w:type="spellStart"/>
             <w:r>
@@ -34158,6 +33992,7 @@
     <w:lsdException w:name="HTML Sample" w:semiHidden="1" w:unhideWhenUsed="1"/>
     <w:lsdException w:name="HTML Typewriter" w:semiHidden="1" w:unhideWhenUsed="1"/>
     <w:lsdException w:name="HTML Variable" w:semiHidden="1" w:unhideWhenUsed="1"/>
+    <w:lsdException w:name="Normal Table" w:semiHidden="1" w:unhideWhenUsed="1"/>
     <w:lsdException w:name="annotation subject" w:semiHidden="1" w:unhideWhenUsed="1"/>
     <w:lsdException w:name="No List" w:semiHidden="1" w:unhideWhenUsed="1"/>
     <w:lsdException w:name="Outline List 1" w:semiHidden="1" w:unhideWhenUsed="1"/>
@@ -34204,8 +34039,10 @@
     <w:lsdException w:name="Table Subtle 2" w:semiHidden="1" w:unhideWhenUsed="1"/>
     <w:lsdException w:name="Table Web 1" w:semiHidden="1" w:unhideWhenUsed="1"/>
     <w:lsdException w:name="Table Web 2" w:semiHidden="1" w:unhideWhenUsed="1"/>
+    <w:lsdException w:name="Table Web 3" w:semiHidden="1" w:unhideWhenUsed="1"/>
     <w:lsdException w:name="Balloon Text" w:semiHidden="1" w:unhideWhenUsed="1"/>
     <w:lsdException w:name="Table Grid" w:uiPriority="0"/>
+    <w:lsdException w:name="Table Theme" w:semiHidden="1" w:unhideWhenUsed="1"/>
     <w:lsdException w:name="Placeholder Text" w:semiHidden="1"/>
     <w:lsdException w:name="No Spacing" w:uiPriority="1" w:qFormat="1"/>
     <w:lsdException w:name="Light Shading" w:uiPriority="60"/>

</xml_diff>